<commit_message>
feat(release): 发布 v3.21.10，统一关键弹窗并修复 InternalPatientInfo 回归
本次提交包含当前对话中的全部未提交更新，主要包括：

- 统一 Fax/Patient Vacation/每日报告 的退出二次确认为脚本自定义弹窗，替换浏览器原生确认框。

- 每日报告无附件发送确认改为同款自定义确认弹窗，保持 UI 风格一致。

- 修复创建传真模板体验：General Notes 二级弹窗层级、输入区高度、底部按钮左侧分区。

- 调整传真默认配置语义：首次/未配置时提供默认值，保留用户显式保存的空值。

- 修复 Patient Vacation 主题名称清洗逻辑，处理 LINK/MUTUAL WITH 等噪声文本。

- 回滚 InternalPatientInfo 顶层不成熟 safe-mode 提前返回，恢复标准启动链路并修复 Add Document Dropzone 回归。

- 同步本轮相关服务、样式与资源文件改动。
</commit_message>
<xml_diff>
--- a/src/assets/fax_cover_sheet.docx
+++ b/src/assets/fax_cover_sheet.docx
@@ -6,20 +6,31 @@
       <w:pPr>
         <w:spacing w:before="400" w:after="120" w:line="240" w:lineRule="auto"/>
         <w:rPr>
+          <w:rFonts w:ascii="Times New Roman" w:hAnsi="Times New Roman" w:cs="Times New Roman" w:hint="eastAsia"/>
+          <w:b/>
+          <w:spacing w:val="-5"/>
+          <w:sz w:val="72"/>
+          <w:lang w:eastAsia="zh-CN"/>
+        </w:rPr>
+      </w:pPr>
+      <w:r>
+        <w:rPr>
           <w:rFonts w:ascii="Times New Roman" w:eastAsia="Times New Roman" w:hAnsi="Times New Roman" w:cs="Times New Roman"/>
           <w:b/>
           <w:spacing w:val="-5"/>
           <w:sz w:val="72"/>
         </w:rPr>
-      </w:pPr>
+        <w:t>ALWAYS</w:t>
+      </w:r>
       <w:r>
         <w:rPr>
-          <w:rFonts w:ascii="Times New Roman" w:eastAsia="Times New Roman" w:hAnsi="Times New Roman" w:cs="Times New Roman"/>
+          <w:rFonts w:ascii="Times New Roman" w:hAnsi="Times New Roman" w:cs="Times New Roman" w:hint="eastAsia"/>
           <w:b/>
           <w:spacing w:val="-5"/>
           <w:sz w:val="72"/>
-        </w:rPr>
-        <w:t>ALWAYS HOME CARE</w:t>
+          <w:lang w:eastAsia="zh-CN"/>
+        </w:rPr>
+        <w:t xml:space="preserve"> HOME CARE</w:t>
       </w:r>
     </w:p>
     <w:p>
@@ -79,11 +90,11 @@
         <w:tblLook w:val="0000" w:firstRow="0" w:lastRow="0" w:firstColumn="0" w:lastColumn="0" w:noHBand="0" w:noVBand="0"/>
       </w:tblPr>
       <w:tblGrid>
-        <w:gridCol w:w="3477"/>
-        <w:gridCol w:w="1459"/>
-        <w:gridCol w:w="592"/>
-        <w:gridCol w:w="2598"/>
-        <w:gridCol w:w="1234"/>
+        <w:gridCol w:w="3636"/>
+        <w:gridCol w:w="1393"/>
+        <w:gridCol w:w="566"/>
+        <w:gridCol w:w="2587"/>
+        <w:gridCol w:w="1178"/>
       </w:tblGrid>
       <w:tr>
         <w:tc>
@@ -323,7 +334,6 @@
             <w:pPr>
               <w:spacing w:after="0" w:line="240" w:lineRule="auto"/>
               <w:rPr>
-                <w:rFonts w:hint="eastAsia"/>
                 <w:lang w:eastAsia="zh-CN"/>
               </w:rPr>
             </w:pPr>
@@ -1043,17 +1053,10 @@
       </w:pPr>
       <w:r>
         <w:rPr>
-          <w:rFonts w:ascii="Times New Roman" w:eastAsia="Times New Roman" w:hAnsi="Times New Roman" w:cs="Times New Roman"/>
-          <w:sz w:val="24"/>
-        </w:rPr>
-        <w:t/>
-      </w:r>
-      <w:r>
-        <w:rPr>
           <w:rFonts w:ascii="Times New Roman" w:hAnsi="Times New Roman" w:cs="Times New Roman"/>
           <w:sz w:val="24"/>
         </w:rPr>
-        <w:t xml:space="preserve">Command: {command}</w:t>
+        <w:t>Command: {command}</w:t>
       </w:r>
     </w:p>
     <w:p>
@@ -1075,21 +1078,12 @@
     </w:p>
     <w:p>
       <w:pPr>
-        <w:spacing w:before="0"/>
         <w:rPr>
           <w:rFonts w:ascii="Times New Roman" w:hAnsi="Times New Roman" w:cs="Times New Roman"/>
           <w:sz w:val="24"/>
           <w:lang w:eastAsia="zh-CN"/>
         </w:rPr>
       </w:pPr>
-      <w:r>
-        <w:rPr>
-          <w:rFonts w:ascii="Times New Roman" w:hAnsi="Times New Roman" w:cs="Times New Roman"/>
-          <w:sz w:val="24"/>
-          <w:lang w:eastAsia="zh-CN"/>
-        </w:rPr>
-        <w:t/>
-      </w:r>
       <w:r>
         <w:rPr>
           <w:rFonts w:ascii="Times New Roman" w:hAnsi="Times New Roman" w:cs="Times New Roman"/>
@@ -1128,7 +1122,6 @@
         <w:rPr>
           <w:rFonts w:ascii="Arial" w:hAnsi="Arial" w:cs="Arial"/>
           <w:b/>
-          <w:sz w:val="22"/>
         </w:rPr>
         <w:t>{signature_block}</w:t>
       </w:r>
@@ -1753,6 +1746,7 @@
   <w:style w:type="character" w:default="1" w:styleId="DefaultParagraphFont">
     <w:name w:val="Default Paragraph Font"/>
     <w:uiPriority w:val="1"/>
+    <w:semiHidden/>
     <w:unhideWhenUsed/>
   </w:style>
   <w:style w:type="table" w:default="1" w:styleId="TableNormal">

</xml_diff>